<commit_message>
Update resume: add pharmacy skills, chemistry foundation, master thesis details
</commit_message>
<xml_diff>
--- a/docs/黄君宝_简历.docx
+++ b/docs/黄君宝_简历.docx
@@ -115,15 +115,15 @@
           <w:sz w:val="22"/>
           <w:szCs w:val="22"/>
         </w:rPr>
-        <w:t xml:space="preserve">吉林大学</w:t>
-      </w:r>
-      <w:r>
-        <w:rPr>
-          <w:rFonts w:ascii="Microsoft YaHei" w:cs="Microsoft YaHei" w:eastAsia="Microsoft YaHei" w:hAnsi="Microsoft YaHei"/>
-          <w:sz w:val="21"/>
-          <w:szCs w:val="21"/>
-        </w:rPr>
-        <w:t xml:space="preserve"> — 本科</w:t>
+        <w:t xml:space="preserve">江西中医药大学</w:t>
+      </w:r>
+      <w:r>
+        <w:rPr>
+          <w:rFonts w:ascii="Microsoft YaHei" w:cs="Microsoft YaHei" w:eastAsia="Microsoft YaHei" w:hAnsi="Microsoft YaHei"/>
+          <w:sz w:val="21"/>
+          <w:szCs w:val="21"/>
+        </w:rPr>
+        <w:t xml:space="preserve"> — 药学学士</w:t>
       </w:r>
     </w:p>
     <w:p>
@@ -138,7 +138,7 @@
           <w:sz w:val="20"/>
           <w:szCs w:val="20"/>
         </w:rPr>
-        <w:t xml:space="preserve">[年份] - 2024.06</w:t>
+        <w:t xml:space="preserve">系统学习药学与化学核心课程，掌握常规药物分析、药理学、药剂学实验操作    |    2020.09 - 2024.06</w:t>
       </w:r>
     </w:p>
     <w:p>
@@ -172,7 +172,8 @@
           <w:sz w:val="24"/>
           <w:szCs w:val="24"/>
         </w:rPr>
-        <w:t xml:space="preserve">EGFR激酶抑制剂QSAR建模  |  独立项目</w:t>
+        <w:t xml:space="preserve">硕士课题：格列本脲CYP2C9/CYP3A4选择性代谢的分子机制：MD与QM联合研究
+Molecular Mechanism of Isoform-Specific Regioselective Metabolism of Glibenclamide by CYP2C9 and CYP3A4: A Combined MD and QM Study</w:t>
       </w:r>
       <w:r>
         <w:rPr>
@@ -181,77 +182,77 @@
           <w:sz w:val="20"/>
           <w:szCs w:val="20"/>
         </w:rPr>
-        <w:t xml:space="preserve">  |  2026.03 - 2026.06</w:t>
-      </w:r>
-    </w:p>
-    <w:p>
-      <w:pPr>
-        <w:spacing w:after="20" w:before="20"/>
-        <w:ind w:left="360"/>
-      </w:pPr>
-      <w:r>
-        <w:rPr>
-          <w:rFonts w:ascii="Microsoft YaHei" w:cs="Microsoft YaHei" w:eastAsia="Microsoft YaHei" w:hAnsi="Microsoft YaHei"/>
-          <w:sz w:val="21"/>
-          <w:szCs w:val="21"/>
-        </w:rPr>
-        <w:t xml:space="preserve">• 从ChEMBL 33获取6,896个EGFR激酶抑制剂的pIC50活性数据</w:t>
-      </w:r>
-    </w:p>
-    <w:p>
-      <w:pPr>
-        <w:spacing w:after="20" w:before="20"/>
-        <w:ind w:left="360"/>
-      </w:pPr>
-      <w:r>
-        <w:rPr>
-          <w:rFonts w:ascii="Microsoft YaHei" w:cs="Microsoft YaHei" w:eastAsia="Microsoft YaHei" w:hAnsi="Microsoft YaHei"/>
-          <w:sz w:val="21"/>
-          <w:szCs w:val="21"/>
-        </w:rPr>
-        <w:t xml:space="preserve">• 使用RDKit提取12个2D分子描述符（MW, logP, TPSA, HBD, HBA等）构建特征矩阵</w:t>
-      </w:r>
-    </w:p>
-    <w:p>
-      <w:pPr>
-        <w:spacing w:after="20" w:before="20"/>
-        <w:ind w:left="360"/>
-      </w:pPr>
-      <w:r>
-        <w:rPr>
-          <w:rFonts w:ascii="Microsoft YaHei" w:cs="Microsoft YaHei" w:eastAsia="Microsoft YaHei" w:hAnsi="Microsoft YaHei"/>
-          <w:sz w:val="21"/>
-          <w:szCs w:val="21"/>
-        </w:rPr>
-        <w:t xml:space="preserve">• 对比Random Forest与Gradient Boosting，最优RF达测试集R²=0.45、5-fold CV R²=0.49</w:t>
-      </w:r>
-    </w:p>
-    <w:p>
-      <w:pPr>
-        <w:spacing w:after="20" w:before="20"/>
-        <w:ind w:left="360"/>
-      </w:pPr>
-      <w:r>
-        <w:rPr>
-          <w:rFonts w:ascii="Microsoft YaHei" w:cs="Microsoft YaHei" w:eastAsia="Microsoft YaHei" w:hAnsi="Microsoft YaHei"/>
-          <w:sz w:val="21"/>
-          <w:szCs w:val="21"/>
-        </w:rPr>
-        <w:t xml:space="preserve">• 特征重要性分析发现TPSA、logP和芳香环数为Top 3，与EGFR激酶口袋理化性质一致</w:t>
-      </w:r>
-    </w:p>
-    <w:p>
-      <w:pPr>
-        <w:spacing w:after="20" w:before="20"/>
-        <w:ind w:left="360"/>
-      </w:pPr>
-      <w:r>
-        <w:rPr>
-          <w:rFonts w:ascii="Microsoft YaHei" w:cs="Microsoft YaHei" w:eastAsia="Microsoft YaHei" w:hAnsi="Microsoft YaHei"/>
-          <w:sz w:val="21"/>
-          <w:szCs w:val="21"/>
-        </w:rPr>
-        <w:t xml:space="preserve">• 完整pipeline自动化：数据清洗→特征提取→模型训练→交叉验证→可视化</w:t>
+        <w:t xml:space="preserve">  |  2025.03 - 至今</w:t>
+      </w:r>
+    </w:p>
+    <w:p>
+      <w:pPr>
+        <w:spacing w:after="20" w:before="20"/>
+        <w:ind w:left="360"/>
+      </w:pPr>
+      <w:r>
+        <w:rPr>
+          <w:rFonts w:ascii="Microsoft YaHei" w:cs="Microsoft YaHei" w:eastAsia="Microsoft YaHei" w:hAnsi="Microsoft YaHei"/>
+          <w:sz w:val="21"/>
+          <w:szCs w:val="21"/>
+        </w:rPr>
+        <w:t xml:space="preserve">• 采用分子对接-500ns全原子MD模拟-MM/GBSA自由能计算-QM反应能垒计算的多尺度策略，系统解析两种CYP同工酶对格列本脲代谢选择性差异的分子机制</w:t>
+      </w:r>
+    </w:p>
+    <w:p>
+      <w:pPr>
+        <w:spacing w:after="20" w:before="20"/>
+        <w:ind w:left="360"/>
+      </w:pPr>
+      <w:r>
+        <w:rPr>
+          <w:rFonts w:ascii="Microsoft YaHei" w:cs="Microsoft YaHei" w:eastAsia="Microsoft YaHei" w:hAnsi="Microsoft YaHei"/>
+          <w:sz w:val="21"/>
+          <w:szCs w:val="21"/>
+        </w:rPr>
+        <w:t xml:space="preserve">• 完成3个体系共1.5μs分子动力学模拟，通过NAC统计与距离监测定量分析反应可及性，明确CYP2C9优势代谢位点为环己基C4、CYP3A4为乙基桥C2'</w:t>
+      </w:r>
+    </w:p>
+    <w:p>
+      <w:pPr>
+        <w:spacing w:after="20" w:before="20"/>
+        <w:ind w:left="360"/>
+      </w:pPr>
+      <w:r>
+        <w:rPr>
+          <w:rFonts w:ascii="Microsoft YaHei" w:cs="Microsoft YaHei" w:eastAsia="Microsoft YaHei" w:hAnsi="Microsoft YaHei"/>
+          <w:sz w:val="21"/>
+          <w:szCs w:val="21"/>
+        </w:rPr>
+        <w:t xml:space="preserve">• 残基水平能量分解鉴定关键作用残基：CYP2C9三苯丙氨酸簇（Phe100/114/476）、CYP3A4五苯丙氨酸簇（Phe108/213/215/220/304），揭示π-π堆积与疏水作用的稳定机制</w:t>
+      </w:r>
+    </w:p>
+    <w:p>
+      <w:pPr>
+        <w:spacing w:after="20" w:before="20"/>
+        <w:ind w:left="360"/>
+      </w:pPr>
+      <w:r>
+        <w:rPr>
+          <w:rFonts w:ascii="Microsoft YaHei" w:cs="Microsoft YaHei" w:eastAsia="Microsoft YaHei" w:hAnsi="Microsoft YaHei"/>
+          <w:sz w:val="21"/>
+          <w:szCs w:val="21"/>
+        </w:rPr>
+        <w:t xml:space="preserve">• 基于Gaussian 16完成4个反应位点氢提取能垒计算，构建"热力学稳定性→反应可及性→电子反应性"完整证据链，首次提出四因素协同解释模型</w:t>
+      </w:r>
+    </w:p>
+    <w:p>
+      <w:pPr>
+        <w:spacing w:after="20" w:before="20"/>
+        <w:ind w:left="360"/>
+      </w:pPr>
+      <w:r>
+        <w:rPr>
+          <w:rFonts w:ascii="Microsoft YaHei" w:cs="Microsoft YaHei" w:eastAsia="Microsoft YaHei" w:hAnsi="Microsoft YaHei"/>
+          <w:sz w:val="21"/>
+          <w:szCs w:val="21"/>
+        </w:rPr>
+        <w:t xml:space="preserve">• 论文已完成，目标投稿JCIM / PCCP等计算化学领域期刊</w:t>
       </w:r>
     </w:p>
     <w:p>
@@ -266,7 +267,7 @@
           <w:sz w:val="24"/>
           <w:szCs w:val="24"/>
         </w:rPr>
-        <w:t xml:space="preserve">MD轨迹自动化分析工具  |  独立项目</w:t>
+        <w:t xml:space="preserve">EGFR激酶抑制剂QSAR建模  |  独立项目</w:t>
       </w:r>
       <w:r>
         <w:rPr>
@@ -275,63 +276,77 @@
           <w:sz w:val="20"/>
           <w:szCs w:val="20"/>
         </w:rPr>
-        <w:t xml:space="preserve">  |  2026.05 - 2026.06</w:t>
-      </w:r>
-    </w:p>
-    <w:p>
-      <w:pPr>
-        <w:spacing w:after="20" w:before="20"/>
-        <w:ind w:left="360"/>
-      </w:pPr>
-      <w:r>
-        <w:rPr>
-          <w:rFonts w:ascii="Microsoft YaHei" w:cs="Microsoft YaHei" w:eastAsia="Microsoft YaHei" w:hAnsi="Microsoft YaHei"/>
-          <w:sz w:val="21"/>
-          <w:szCs w:val="21"/>
-        </w:rPr>
-        <w:t xml:space="preserve">• 基于Python + MDTraj开发AMBER/GROMACS轨迹自动化分析脚本</w:t>
-      </w:r>
-    </w:p>
-    <w:p>
-      <w:pPr>
-        <w:spacing w:after="20" w:before="20"/>
-        <w:ind w:left="360"/>
-      </w:pPr>
-      <w:r>
-        <w:rPr>
-          <w:rFonts w:ascii="Microsoft YaHei" w:cs="Microsoft YaHei" w:eastAsia="Microsoft YaHei" w:hAnsi="Microsoft YaHei"/>
-          <w:sz w:val="21"/>
-          <w:szCs w:val="21"/>
-        </w:rPr>
-        <w:t xml:space="preserve">• 实现RMSD/RMSF/Rg/PCA本质动力学/自由能景观/配体-蛋白氢键分析</w:t>
-      </w:r>
-    </w:p>
-    <w:p>
-      <w:pPr>
-        <w:spacing w:after="20" w:before="20"/>
-        <w:ind w:left="360"/>
-      </w:pPr>
-      <w:r>
-        <w:rPr>
-          <w:rFonts w:ascii="Microsoft YaHei" w:cs="Microsoft YaHei" w:eastAsia="Microsoft YaHei" w:hAnsi="Microsoft YaHei"/>
-          <w:sz w:val="21"/>
-          <w:szCs w:val="21"/>
-        </w:rPr>
-        <w:t xml:space="preserve">• 六合一分析图自动生成，替代GROMACS命令行+VMD手动操作流程</w:t>
-      </w:r>
-    </w:p>
-    <w:p>
-      <w:pPr>
-        <w:spacing w:after="20" w:before="20"/>
-        <w:ind w:left="360"/>
-      </w:pPr>
-      <w:r>
-        <w:rPr>
-          <w:rFonts w:ascii="Microsoft YaHei" w:cs="Microsoft YaHei" w:eastAsia="Microsoft YaHei" w:hAnsi="Microsoft YaHei"/>
-          <w:sz w:val="21"/>
-          <w:szCs w:val="21"/>
-        </w:rPr>
-        <w:t xml:space="preserve">• 应用于500ns蛋白-配体复合物轨迹，识别与配体形成氢键占有率&gt;50%的关键残基</w:t>
+        <w:t xml:space="preserve">  |  2026.03 - 2026.06</w:t>
+      </w:r>
+    </w:p>
+    <w:p>
+      <w:pPr>
+        <w:spacing w:after="20" w:before="20"/>
+        <w:ind w:left="360"/>
+      </w:pPr>
+      <w:r>
+        <w:rPr>
+          <w:rFonts w:ascii="Microsoft YaHei" w:cs="Microsoft YaHei" w:eastAsia="Microsoft YaHei" w:hAnsi="Microsoft YaHei"/>
+          <w:sz w:val="21"/>
+          <w:szCs w:val="21"/>
+        </w:rPr>
+        <w:t xml:space="preserve">• 从ChEMBL 33获取6,896个EGFR激酶抑制剂的pIC50活性数据</w:t>
+      </w:r>
+    </w:p>
+    <w:p>
+      <w:pPr>
+        <w:spacing w:after="20" w:before="20"/>
+        <w:ind w:left="360"/>
+      </w:pPr>
+      <w:r>
+        <w:rPr>
+          <w:rFonts w:ascii="Microsoft YaHei" w:cs="Microsoft YaHei" w:eastAsia="Microsoft YaHei" w:hAnsi="Microsoft YaHei"/>
+          <w:sz w:val="21"/>
+          <w:szCs w:val="21"/>
+        </w:rPr>
+        <w:t xml:space="preserve">• 使用RDKit提取12个2D分子描述符（MW, logP, TPSA, HBD, HBA等）构建特征矩阵</w:t>
+      </w:r>
+    </w:p>
+    <w:p>
+      <w:pPr>
+        <w:spacing w:after="20" w:before="20"/>
+        <w:ind w:left="360"/>
+      </w:pPr>
+      <w:r>
+        <w:rPr>
+          <w:rFonts w:ascii="Microsoft YaHei" w:cs="Microsoft YaHei" w:eastAsia="Microsoft YaHei" w:hAnsi="Microsoft YaHei"/>
+          <w:sz w:val="21"/>
+          <w:szCs w:val="21"/>
+        </w:rPr>
+        <w:t xml:space="preserve">• 对比Random Forest与Gradient Boosting，最优RF达测试集R²=0.45、5-fold CV R²=0.49</w:t>
+      </w:r>
+    </w:p>
+    <w:p>
+      <w:pPr>
+        <w:spacing w:after="20" w:before="20"/>
+        <w:ind w:left="360"/>
+      </w:pPr>
+      <w:r>
+        <w:rPr>
+          <w:rFonts w:ascii="Microsoft YaHei" w:cs="Microsoft YaHei" w:eastAsia="Microsoft YaHei" w:hAnsi="Microsoft YaHei"/>
+          <w:sz w:val="21"/>
+          <w:szCs w:val="21"/>
+        </w:rPr>
+        <w:t xml:space="preserve">• 特征重要性分析发现TPSA、logP和芳香环数为Top 3，与EGFR激酶口袋理化性质一致</w:t>
+      </w:r>
+    </w:p>
+    <w:p>
+      <w:pPr>
+        <w:spacing w:after="20" w:before="20"/>
+        <w:ind w:left="360"/>
+      </w:pPr>
+      <w:r>
+        <w:rPr>
+          <w:rFonts w:ascii="Microsoft YaHei" w:cs="Microsoft YaHei" w:eastAsia="Microsoft YaHei" w:hAnsi="Microsoft YaHei"/>
+          <w:sz w:val="21"/>
+          <w:szCs w:val="21"/>
+        </w:rPr>
+        <w:t xml:space="preserve">• 完整pipeline自动化：数据清洗→特征提取→模型训练→交叉验证→可视化</w:t>
       </w:r>
     </w:p>
     <w:p>
@@ -346,7 +361,7 @@
           <w:sz w:val="24"/>
           <w:szCs w:val="24"/>
         </w:rPr>
-        <w:t xml:space="preserve">硕士课题：CADD方法整合与药物设计</w:t>
+        <w:t xml:space="preserve">MD轨迹自动化分析工具  |  独立项目</w:t>
       </w:r>
       <w:r>
         <w:rPr>
@@ -355,35 +370,63 @@
           <w:sz w:val="20"/>
           <w:szCs w:val="20"/>
         </w:rPr>
-        <w:t xml:space="preserve">  |  2025 - 至今</w:t>
-      </w:r>
-    </w:p>
-    <w:p>
-      <w:pPr>
-        <w:spacing w:after="20" w:before="20"/>
-        <w:ind w:left="360"/>
-      </w:pPr>
-      <w:r>
-        <w:rPr>
-          <w:rFonts w:ascii="Microsoft YaHei" w:cs="Microsoft YaHei" w:eastAsia="Microsoft YaHei" w:hAnsi="Microsoft YaHei"/>
-          <w:sz w:val="21"/>
-          <w:szCs w:val="21"/>
-        </w:rPr>
-        <w:t xml:space="preserve">• 整合分子对接、MD模拟、QM计算建立完整的计算机辅助药物设计管线</w:t>
-      </w:r>
-    </w:p>
-    <w:p>
-      <w:pPr>
-        <w:spacing w:after="20" w:before="20"/>
-        <w:ind w:left="360"/>
-      </w:pPr>
-      <w:r>
-        <w:rPr>
-          <w:rFonts w:ascii="Microsoft YaHei" w:cs="Microsoft YaHei" w:eastAsia="Microsoft YaHei" w:hAnsi="Microsoft YaHei"/>
-          <w:sz w:val="21"/>
-          <w:szCs w:val="21"/>
-        </w:rPr>
-        <w:t xml:space="preserve">• 论文投稿中</w:t>
+        <w:t xml:space="preserve">  |  2026.05 - 2026.06</w:t>
+      </w:r>
+    </w:p>
+    <w:p>
+      <w:pPr>
+        <w:spacing w:after="20" w:before="20"/>
+        <w:ind w:left="360"/>
+      </w:pPr>
+      <w:r>
+        <w:rPr>
+          <w:rFonts w:ascii="Microsoft YaHei" w:cs="Microsoft YaHei" w:eastAsia="Microsoft YaHei" w:hAnsi="Microsoft YaHei"/>
+          <w:sz w:val="21"/>
+          <w:szCs w:val="21"/>
+        </w:rPr>
+        <w:t xml:space="preserve">• 基于Python + MDTraj开发AMBER/GROMACS轨迹自动化分析脚本</w:t>
+      </w:r>
+    </w:p>
+    <w:p>
+      <w:pPr>
+        <w:spacing w:after="20" w:before="20"/>
+        <w:ind w:left="360"/>
+      </w:pPr>
+      <w:r>
+        <w:rPr>
+          <w:rFonts w:ascii="Microsoft YaHei" w:cs="Microsoft YaHei" w:eastAsia="Microsoft YaHei" w:hAnsi="Microsoft YaHei"/>
+          <w:sz w:val="21"/>
+          <w:szCs w:val="21"/>
+        </w:rPr>
+        <w:t xml:space="preserve">• 实现RMSD/RMSF/Rg/PCA本质动力学/自由能景观/配体-蛋白氢键分析</w:t>
+      </w:r>
+    </w:p>
+    <w:p>
+      <w:pPr>
+        <w:spacing w:after="20" w:before="20"/>
+        <w:ind w:left="360"/>
+      </w:pPr>
+      <w:r>
+        <w:rPr>
+          <w:rFonts w:ascii="Microsoft YaHei" w:cs="Microsoft YaHei" w:eastAsia="Microsoft YaHei" w:hAnsi="Microsoft YaHei"/>
+          <w:sz w:val="21"/>
+          <w:szCs w:val="21"/>
+        </w:rPr>
+        <w:t xml:space="preserve">• 六合一分析图自动生成，替代GROMACS命令行+VMD手动操作流程</w:t>
+      </w:r>
+    </w:p>
+    <w:p>
+      <w:pPr>
+        <w:spacing w:after="20" w:before="20"/>
+        <w:ind w:left="360"/>
+      </w:pPr>
+      <w:r>
+        <w:rPr>
+          <w:rFonts w:ascii="Microsoft YaHei" w:cs="Microsoft YaHei" w:eastAsia="Microsoft YaHei" w:hAnsi="Microsoft YaHei"/>
+          <w:sz w:val="21"/>
+          <w:szCs w:val="21"/>
+        </w:rPr>
+        <w:t xml:space="preserve">• 应用于500ns蛋白-配体复合物轨迹，识别与配体形成氢键占有率&gt;50%的关键残基</w:t>
       </w:r>
     </w:p>
     <w:p>
@@ -421,6 +464,124 @@
         <w:gridCol w:w="1800"/>
         <w:gridCol w:w="7200"/>
       </w:tblGrid>
+      <w:tr>
+        <w:tc>
+          <w:tcPr>
+            <w:tcW w:type="dxa" w:w="1800"/>
+            <w:tcBorders>
+              <w:top w:val="single" w:color="CCCCCC" w:sz="1"/>
+              <w:left w:val="single" w:color="CCCCCC" w:sz="1"/>
+              <w:bottom w:val="single" w:color="CCCCCC" w:sz="1"/>
+              <w:right w:val="single" w:color="CCCCCC" w:sz="1"/>
+            </w:tcBorders>
+            <w:shd w:fill="E8F0F8" w:val="clear"/>
+            <w:tcMar>
+              <w:top w:type="dxa" w:w="60"/>
+              <w:left w:type="dxa" w:w="100"/>
+              <w:bottom w:type="dxa" w:w="60"/>
+              <w:right w:type="dxa" w:w="100"/>
+            </w:tcMar>
+          </w:tcPr>
+          <w:p>
+            <w:r>
+              <w:rPr>
+                <w:rFonts w:ascii="Microsoft YaHei" w:cs="Microsoft YaHei" w:eastAsia="Microsoft YaHei" w:hAnsi="Microsoft YaHei"/>
+                <w:b/>
+                <w:bCs/>
+                <w:sz w:val="20"/>
+                <w:szCs w:val="20"/>
+              </w:rPr>
+              <w:t xml:space="preserve">药学与实验技能</w:t>
+            </w:r>
+          </w:p>
+        </w:tc>
+        <w:tc>
+          <w:tcPr>
+            <w:tcW w:type="dxa" w:w="7200"/>
+            <w:tcBorders>
+              <w:top w:val="single" w:color="CCCCCC" w:sz="1"/>
+              <w:left w:val="single" w:color="CCCCCC" w:sz="1"/>
+              <w:bottom w:val="single" w:color="CCCCCC" w:sz="1"/>
+              <w:right w:val="single" w:color="CCCCCC" w:sz="1"/>
+            </w:tcBorders>
+            <w:tcMar>
+              <w:top w:type="dxa" w:w="60"/>
+              <w:left w:type="dxa" w:w="100"/>
+              <w:bottom w:type="dxa" w:w="60"/>
+              <w:right w:type="dxa" w:w="100"/>
+            </w:tcMar>
+          </w:tcPr>
+          <w:p>
+            <w:r>
+              <w:rPr>
+                <w:rFonts w:ascii="Microsoft YaHei" w:cs="Microsoft YaHei" w:eastAsia="Microsoft YaHei" w:hAnsi="Microsoft YaHei"/>
+                <w:sz w:val="20"/>
+                <w:szCs w:val="20"/>
+              </w:rPr>
+              <w:t xml:space="preserve">熟练掌握四大药学（药理/药分/药化/药剂）、天然药化；熟悉有机合成、药物分析、药剂学、药理学等实验操作；能独立完成药理活性筛选、药物含量测定、制剂制备等常规实验</w:t>
+            </w:r>
+          </w:p>
+        </w:tc>
+      </w:tr>
+      <w:tr>
+        <w:tc>
+          <w:tcPr>
+            <w:tcW w:type="dxa" w:w="1800"/>
+            <w:tcBorders>
+              <w:top w:val="single" w:color="CCCCCC" w:sz="1"/>
+              <w:left w:val="single" w:color="CCCCCC" w:sz="1"/>
+              <w:bottom w:val="single" w:color="CCCCCC" w:sz="1"/>
+              <w:right w:val="single" w:color="CCCCCC" w:sz="1"/>
+            </w:tcBorders>
+            <w:shd w:fill="E8F0F8" w:val="clear"/>
+            <w:tcMar>
+              <w:top w:type="dxa" w:w="60"/>
+              <w:left w:type="dxa" w:w="100"/>
+              <w:bottom w:type="dxa" w:w="60"/>
+              <w:right w:type="dxa" w:w="100"/>
+            </w:tcMar>
+          </w:tcPr>
+          <w:p>
+            <w:r>
+              <w:rPr>
+                <w:rFonts w:ascii="Microsoft YaHei" w:cs="Microsoft YaHei" w:eastAsia="Microsoft YaHei" w:hAnsi="Microsoft YaHei"/>
+                <w:b/>
+                <w:bCs/>
+                <w:sz w:val="20"/>
+                <w:szCs w:val="20"/>
+              </w:rPr>
+              <w:t xml:space="preserve">化学基础</w:t>
+            </w:r>
+          </w:p>
+        </w:tc>
+        <w:tc>
+          <w:tcPr>
+            <w:tcW w:type="dxa" w:w="7200"/>
+            <w:tcBorders>
+              <w:top w:val="single" w:color="CCCCCC" w:sz="1"/>
+              <w:left w:val="single" w:color="CCCCCC" w:sz="1"/>
+              <w:bottom w:val="single" w:color="CCCCCC" w:sz="1"/>
+              <w:right w:val="single" w:color="CCCCCC" w:sz="1"/>
+            </w:tcBorders>
+            <w:tcMar>
+              <w:top w:type="dxa" w:w="60"/>
+              <w:left w:type="dxa" w:w="100"/>
+              <w:bottom w:type="dxa" w:w="60"/>
+              <w:right w:type="dxa" w:w="100"/>
+            </w:tcMar>
+          </w:tcPr>
+          <w:p>
+            <w:r>
+              <w:rPr>
+                <w:rFonts w:ascii="Microsoft YaHei" w:cs="Microsoft YaHei" w:eastAsia="Microsoft YaHei" w:hAnsi="Microsoft YaHei"/>
+                <w:sz w:val="20"/>
+                <w:szCs w:val="20"/>
+              </w:rPr>
+              <w:t xml:space="preserve">系统掌握有机化学、无机化学、分析化学、物理化学、生物化学核心理论，具备扎实的化学键理论、热力学、动力学、光谱分析等基础知识</w:t>
+            </w:r>
+          </w:p>
+        </w:tc>
+      </w:tr>
       <w:tr>
         <w:tc>
           <w:tcPr>
@@ -687,7 +848,7 @@
           <w:sz w:val="21"/>
           <w:szCs w:val="21"/>
         </w:rPr>
-        <w:t xml:space="preserve">药物化学硕士，精通分子对接、MD模拟和QM计算。自学Python和机器学习，能独立完成从数据获取到模型训练的完整计算化学分析管线。擅长将传统CADD的物理化学理解与ML工具结合，做出有物理意义的AI辅助分析。代码在GitHub开源。</w:t>
+        <w:t xml:space="preserve">药物化学硕士，具备完整的计算化学研究能力，熟练掌握分子对接、分子动力学模拟、自由能计算与量子化学计算等多尺度模拟方法。自学Python与机器学习，能独立完成从数据获取、特征工程到模型训练评估的完整QSAR建模管线。擅长将传统CADD的物理化学理解与机器学习方法结合，开展有机制深度的计算研究。GitHub开源多个计算化学分析工具。</w:t>
       </w:r>
     </w:p>
     <w:p>
@@ -724,7 +885,7 @@
     </w:p>
     <w:sectPr>
       <w:pgSz w:w="11906" w:h="16838" w:orient="portrait"/>
-      <w:pgMar w:top="1200" w:right="1300" w:bottom="1200" w:left="1300" w:header="708" w:footer="708" w:gutter="0"/>
+      <w:pgMar w:top="1000" w:right="1300" w:bottom="1000" w:left="1300" w:header="708" w:footer="708" w:gutter="0"/>
       <w:pgNumType/>
       <w:docGrid w:linePitch="360"/>
     </w:sectPr>

</xml_diff>